<commit_message>
Mise à jour automatique de la rédaction Keyos-Éditions
</commit_message>
<xml_diff>
--- a/redaction/chapitre10/paragraphes.docx
+++ b/redaction/chapitre10/paragraphes.docx
@@ -2,13 +2,13 @@
 <file path=word/document.xml><?xml version="1.0" encoding="utf-8"?>
 <w:document xmlns:w="http://schemas.openxmlformats.org/wordprocessingml/2006/main" xmlns:m="http://schemas.openxmlformats.org/officeDocument/2006/math" xmlns:r="http://schemas.openxmlformats.org/officeDocument/2006/relationships" xmlns:o="urn:schemas-microsoft-com:office:office" xmlns:v="urn:schemas-microsoft-com:vml" xmlns:w10="urn:schemas-microsoft-com:office:word" xmlns:a="http://schemas.openxmlformats.org/drawingml/2006/main" xmlns:pic="http://schemas.openxmlformats.org/drawingml/2006/picture" xmlns:wp="http://schemas.openxmlformats.org/drawingml/2006/wordprocessingDrawing">
   <w:body>
-    <w:bookmarkStart w:id="25" w:name="Xb47c179138efa8d1ca7bbb81e04ffa4aa2f2235"/>
+    <w:bookmarkStart w:id="26" w:name="chapitre-8-traiter-une-masse-de-données"/>
     <w:p>
       <w:pPr>
         <w:pStyle w:val="Heading1"/>
       </w:pPr>
       <w:r>
-        <w:t xml:space="preserve">Chapitre 10 : Un code plus robuste en prenant en compte les erreurs</w:t>
+        <w:t xml:space="preserve">Chapitre 8 : Traiter une masse de données</w:t>
       </w:r>
     </w:p>
     <w:p>
@@ -16,7 +16,7 @@
         <w:pStyle w:val="FirstParagraph"/>
       </w:pPr>
       <w:r>
-        <w:t xml:space="preserve">La gestion des erreurs permet d’anticiper et de traiter les incidents d’exécution pour empêcher l’arrêt brutal d’un programme en Python. Maîtriser ces mécanismes est indispensable pour concevoir des applications fiables et résilientes.</w:t>
+        <w:t xml:space="preserve">Le traitement de masses de données permet d’appliquer des transformations et des filtres performants sur des collections en Python. Maîtriser ces outils fonctionnels est indispensable pour manipuler efficacement des flux d’informations importants.</w:t>
       </w:r>
       <w:r>
         <w:t xml:space="preserve"> </w:t>
@@ -33,49 +33,16 @@
         </w:numPr>
       </w:pPr>
       <w:r>
-        <w:t xml:space="preserve">Gestion des exceptions (</w:t>
+        <w:t xml:space="preserve">Fonctions anonymes</w:t>
+      </w:r>
+      <w:r>
+        <w:t xml:space="preserve"> </w:t>
       </w:r>
       <w:r>
         <w:rPr>
           <w:rStyle w:val="VerbatimChar"/>
         </w:rPr>
-        <w:t xml:space="preserve">try</w:t>
-      </w:r>
-      <w:r>
-        <w:t xml:space="preserve">,</w:t>
-      </w:r>
-      <w:r>
-        <w:t xml:space="preserve"> </w:t>
-      </w:r>
-      <w:r>
-        <w:rPr>
-          <w:rStyle w:val="VerbatimChar"/>
-        </w:rPr>
-        <w:t xml:space="preserve">except</w:t>
-      </w:r>
-      <w:r>
-        <w:t xml:space="preserve">,</w:t>
-      </w:r>
-      <w:r>
-        <w:t xml:space="preserve"> </w:t>
-      </w:r>
-      <w:r>
-        <w:rPr>
-          <w:rStyle w:val="VerbatimChar"/>
-        </w:rPr>
-        <w:t xml:space="preserve">finally</w:t>
-      </w:r>
-      <w:r>
-        <w:t xml:space="preserve">) et levée d’exceptions (</w:t>
-      </w:r>
-      <w:r>
-        <w:rPr>
-          <w:rStyle w:val="VerbatimChar"/>
-        </w:rPr>
-        <w:t xml:space="preserve">raise</w:t>
-      </w:r>
-      <w:r>
-        <w:t xml:space="preserve">)</w:t>
+        <w:t xml:space="preserve">lambda</w:t>
       </w:r>
     </w:p>
     <w:p>
@@ -86,7 +53,7 @@
         </w:numPr>
       </w:pPr>
       <w:r>
-        <w:t xml:space="preserve">Utilisation de l’instruction</w:t>
+        <w:t xml:space="preserve">Filtrage de données avec</w:t>
       </w:r>
       <w:r>
         <w:t xml:space="preserve"> </w:t>
@@ -95,7 +62,7 @@
         <w:rPr>
           <w:rStyle w:val="VerbatimChar"/>
         </w:rPr>
-        <w:t xml:space="preserve">finally</w:t>
+        <w:t xml:space="preserve">filter</w:t>
       </w:r>
     </w:p>
     <w:p>
@@ -106,7 +73,36 @@
         </w:numPr>
       </w:pPr>
       <w:r>
-        <w:t xml:space="preserve">Émission personnalisée d’une exception</w:t>
+        <w:t xml:space="preserve">Transformation de données avec</w:t>
+      </w:r>
+      <w:r>
+        <w:t xml:space="preserve"> </w:t>
+      </w:r>
+      <w:r>
+        <w:rPr>
+          <w:rStyle w:val="VerbatimChar"/>
+        </w:rPr>
+        <w:t xml:space="preserve">map</w:t>
+      </w:r>
+    </w:p>
+    <w:p>
+      <w:pPr>
+        <w:numPr>
+          <w:ilvl w:val="0"/>
+          <w:numId w:val="1001"/>
+        </w:numPr>
+      </w:pPr>
+      <w:r>
+        <w:t xml:space="preserve">Agrégation de données avec</w:t>
+      </w:r>
+      <w:r>
+        <w:t xml:space="preserve"> </w:t>
+      </w:r>
+      <w:r>
+        <w:rPr>
+          <w:rStyle w:val="VerbatimChar"/>
+        </w:rPr>
+        <w:t xml:space="preserve">reduce</w:t>
       </w:r>
     </w:p>
     <w:p>
@@ -116,13 +112,13 @@
         </w:pict>
       </w:r>
     </w:p>
-    <w:bookmarkStart w:id="20" w:name="X964e25c99b3c8e5097eb976c7a761e27fa31936"/>
+    <w:bookmarkStart w:id="20" w:name="fonction-anonyme-lambda"/>
     <w:p>
       <w:pPr>
         <w:pStyle w:val="Heading2"/>
       </w:pPr>
       <w:r>
-        <w:t xml:space="preserve">Gestion des exceptions : try catch finally et throw</w:t>
+        <w:t xml:space="preserve">Fonction anonyme Lambda</w:t>
       </w:r>
     </w:p>
     <w:p>
@@ -130,7 +126,7 @@
         <w:pStyle w:val="FirstParagraph"/>
       </w:pPr>
       <w:r>
-        <w:t xml:space="preserve">La gestion des exceptions repose sur le bloc</w:t>
+        <w:t xml:space="preserve">Une fonction anonyme, introduite par le mot-clé</w:t>
       </w:r>
       <w:r>
         <w:t xml:space="preserve"> </w:t>
@@ -139,13 +135,113 @@
         <w:rPr>
           <w:rStyle w:val="VerbatimChar"/>
         </w:rPr>
-        <w:t xml:space="preserve">try</w:t>
-      </w:r>
-      <w:r>
-        <w:t xml:space="preserve"> </w:t>
-      </w:r>
-      <w:r>
-        <w:t xml:space="preserve">pour surveiller le code à risque et</w:t>
+        <w:t xml:space="preserve">lambda</w:t>
+      </w:r>
+      <w:r>
+        <w:t xml:space="preserve">, permet de définir rapidement une fonction compacte sans nom sur une seule ligne de code. Elle est idéale pour des traitements courts et ponctuels.</w:t>
+      </w:r>
+    </w:p>
+    <w:p>
+      <w:pPr>
+        <w:pStyle w:val="SourceCode"/>
+      </w:pPr>
+      <w:r>
+        <w:rPr>
+          <w:rStyle w:val="CommentTok"/>
+        </w:rPr>
+        <w:t xml:space="preserve"># Déclaration et appel d'une fonction lambda pour calculer le carré</w:t>
+      </w:r>
+      <w:r>
+        <w:br/>
+      </w:r>
+      <w:r>
+        <w:rPr>
+          <w:rStyle w:val="NormalTok"/>
+        </w:rPr>
+        <w:t xml:space="preserve">carre </w:t>
+      </w:r>
+      <w:r>
+        <w:rPr>
+          <w:rStyle w:val="OperatorTok"/>
+        </w:rPr>
+        <w:t xml:space="preserve">=</w:t>
+      </w:r>
+      <w:r>
+        <w:rPr>
+          <w:rStyle w:val="NormalTok"/>
+        </w:rPr>
+        <w:t xml:space="preserve"> </w:t>
+      </w:r>
+      <w:r>
+        <w:rPr>
+          <w:rStyle w:val="KeywordTok"/>
+        </w:rPr>
+        <w:t xml:space="preserve">lambda</w:t>
+      </w:r>
+      <w:r>
+        <w:rPr>
+          <w:rStyle w:val="NormalTok"/>
+        </w:rPr>
+        <w:t xml:space="preserve"> x: x </w:t>
+      </w:r>
+      <w:r>
+        <w:rPr>
+          <w:rStyle w:val="OperatorTok"/>
+        </w:rPr>
+        <w:t xml:space="preserve">**</w:t>
+      </w:r>
+      <w:r>
+        <w:rPr>
+          <w:rStyle w:val="NormalTok"/>
+        </w:rPr>
+        <w:t xml:space="preserve"> </w:t>
+      </w:r>
+      <w:r>
+        <w:rPr>
+          <w:rStyle w:val="DecValTok"/>
+        </w:rPr>
+        <w:t xml:space="preserve">2</w:t>
+      </w:r>
+      <w:r>
+        <w:br/>
+      </w:r>
+      <w:r>
+        <w:rPr>
+          <w:rStyle w:val="NormalTok"/>
+        </w:rPr>
+        <w:t xml:space="preserve">resultat </w:t>
+      </w:r>
+      <w:r>
+        <w:rPr>
+          <w:rStyle w:val="OperatorTok"/>
+        </w:rPr>
+        <w:t xml:space="preserve">=</w:t>
+      </w:r>
+      <w:r>
+        <w:rPr>
+          <w:rStyle w:val="NormalTok"/>
+        </w:rPr>
+        <w:t xml:space="preserve"> carre(</w:t>
+      </w:r>
+      <w:r>
+        <w:rPr>
+          <w:rStyle w:val="DecValTok"/>
+        </w:rPr>
+        <w:t xml:space="preserve">5</w:t>
+      </w:r>
+      <w:r>
+        <w:rPr>
+          <w:rStyle w:val="NormalTok"/>
+        </w:rPr>
+        <w:t xml:space="preserve">)</w:t>
+      </w:r>
+    </w:p>
+    <w:p>
+      <w:pPr>
+        <w:pStyle w:val="BlockText"/>
+      </w:pPr>
+      <w:r>
+        <w:t xml:space="preserve">💡 Utilisez les fonctions</w:t>
       </w:r>
       <w:r>
         <w:t xml:space="preserve"> </w:t>
@@ -154,13 +250,13 @@
         <w:rPr>
           <w:rStyle w:val="VerbatimChar"/>
         </w:rPr>
-        <w:t xml:space="preserve">except</w:t>
-      </w:r>
-      <w:r>
-        <w:t xml:space="preserve"> </w:t>
-      </w:r>
-      <w:r>
-        <w:t xml:space="preserve">pour intercepter les erreurs survenues. En Python, le mot-clé</w:t>
+        <w:t xml:space="preserve">lambda</w:t>
+      </w:r>
+      <w:r>
+        <w:t xml:space="preserve"> </w:t>
+      </w:r>
+      <w:r>
+        <w:t xml:space="preserve">principalement comme arguments pour des fonctions de traitement de collections comme</w:t>
       </w:r>
       <w:r>
         <w:t xml:space="preserve"> </w:t>
@@ -169,13 +265,13 @@
         <w:rPr>
           <w:rStyle w:val="VerbatimChar"/>
         </w:rPr>
-        <w:t xml:space="preserve">raise</w:t>
-      </w:r>
-      <w:r>
-        <w:t xml:space="preserve"> </w:t>
-      </w:r>
-      <w:r>
-        <w:t xml:space="preserve">équivaut au</w:t>
+        <w:t xml:space="preserve">map</w:t>
+      </w:r>
+      <w:r>
+        <w:t xml:space="preserve"> </w:t>
+      </w:r>
+      <w:r>
+        <w:t xml:space="preserve">ou</w:t>
       </w:r>
       <w:r>
         <w:t xml:space="preserve"> </w:t>
@@ -184,167 +280,10 @@
         <w:rPr>
           <w:rStyle w:val="VerbatimChar"/>
         </w:rPr>
-        <w:t xml:space="preserve">throw</w:t>
-      </w:r>
-      <w:r>
-        <w:t xml:space="preserve"> </w:t>
-      </w:r>
-      <w:r>
-        <w:t xml:space="preserve">des autres langages pour émettre une exception.</w:t>
-      </w:r>
-    </w:p>
-    <w:p>
-      <w:pPr>
-        <w:pStyle w:val="SourceCode"/>
-      </w:pPr>
-      <w:r>
-        <w:rPr>
-          <w:rStyle w:val="CommentTok"/>
-        </w:rPr>
-        <w:t xml:space="preserve"># Interception d'une division par zéro</w:t>
-      </w:r>
-      <w:r>
-        <w:br/>
-      </w:r>
-      <w:r>
-        <w:rPr>
-          <w:rStyle w:val="ControlFlowTok"/>
-        </w:rPr>
-        <w:t xml:space="preserve">try</w:t>
-      </w:r>
-      <w:r>
-        <w:rPr>
-          <w:rStyle w:val="NormalTok"/>
-        </w:rPr>
-        <w:t xml:space="preserve">:</w:t>
-      </w:r>
-      <w:r>
-        <w:br/>
-      </w:r>
-      <w:r>
-        <w:rPr>
-          <w:rStyle w:val="NormalTok"/>
-        </w:rPr>
-        <w:t xml:space="preserve">    resultat </w:t>
-      </w:r>
-      <w:r>
-        <w:rPr>
-          <w:rStyle w:val="OperatorTok"/>
-        </w:rPr>
-        <w:t xml:space="preserve">=</w:t>
-      </w:r>
-      <w:r>
-        <w:rPr>
-          <w:rStyle w:val="NormalTok"/>
-        </w:rPr>
-        <w:t xml:space="preserve"> </w:t>
-      </w:r>
-      <w:r>
-        <w:rPr>
-          <w:rStyle w:val="DecValTok"/>
-        </w:rPr>
-        <w:t xml:space="preserve">10</w:t>
-      </w:r>
-      <w:r>
-        <w:rPr>
-          <w:rStyle w:val="NormalTok"/>
-        </w:rPr>
-        <w:t xml:space="preserve"> </w:t>
-      </w:r>
-      <w:r>
-        <w:rPr>
-          <w:rStyle w:val="OperatorTok"/>
-        </w:rPr>
-        <w:t xml:space="preserve">/</w:t>
-      </w:r>
-      <w:r>
-        <w:rPr>
-          <w:rStyle w:val="NormalTok"/>
-        </w:rPr>
-        <w:t xml:space="preserve"> </w:t>
-      </w:r>
-      <w:r>
-        <w:rPr>
-          <w:rStyle w:val="DecValTok"/>
-        </w:rPr>
-        <w:t xml:space="preserve">0</w:t>
-      </w:r>
-      <w:r>
-        <w:br/>
-      </w:r>
-      <w:r>
-        <w:rPr>
-          <w:rStyle w:val="ControlFlowTok"/>
-        </w:rPr>
-        <w:t xml:space="preserve">except</w:t>
-      </w:r>
-      <w:r>
-        <w:rPr>
-          <w:rStyle w:val="NormalTok"/>
-        </w:rPr>
-        <w:t xml:space="preserve"> </w:t>
-      </w:r>
-      <w:r>
-        <w:rPr>
-          <w:rStyle w:val="PreprocessorTok"/>
-        </w:rPr>
-        <w:t xml:space="preserve">ZeroDivisionError</w:t>
-      </w:r>
-      <w:r>
-        <w:rPr>
-          <w:rStyle w:val="NormalTok"/>
-        </w:rPr>
-        <w:t xml:space="preserve">:</w:t>
-      </w:r>
-      <w:r>
-        <w:br/>
-      </w:r>
-      <w:r>
-        <w:rPr>
-          <w:rStyle w:val="NormalTok"/>
-        </w:rPr>
-        <w:t xml:space="preserve">    resultat </w:t>
-      </w:r>
-      <w:r>
-        <w:rPr>
-          <w:rStyle w:val="OperatorTok"/>
-        </w:rPr>
-        <w:t xml:space="preserve">=</w:t>
-      </w:r>
-      <w:r>
-        <w:rPr>
-          <w:rStyle w:val="NormalTok"/>
-        </w:rPr>
-        <w:t xml:space="preserve"> </w:t>
-      </w:r>
-      <w:r>
-        <w:rPr>
-          <w:rStyle w:val="StringTok"/>
-        </w:rPr>
-        <w:t xml:space="preserve">"Erreur : Division par zéro impossible"</w:t>
-      </w:r>
-    </w:p>
-    <w:p>
-      <w:pPr>
-        <w:pStyle w:val="BlockText"/>
-      </w:pPr>
-      <w:r>
-        <w:t xml:space="preserve">💡 Spécifiez toujours le type précis d’exception à intercepter dans votre bloc</w:t>
-      </w:r>
-      <w:r>
-        <w:t xml:space="preserve"> </w:t>
-      </w:r>
-      <w:r>
-        <w:rPr>
-          <w:rStyle w:val="VerbatimChar"/>
-        </w:rPr>
-        <w:t xml:space="preserve">except</w:t>
-      </w:r>
-      <w:r>
-        <w:t xml:space="preserve"> </w:t>
-      </w:r>
-      <w:r>
-        <w:t xml:space="preserve">plutôt que d’utiliser une clause globale muette qui masquerait des bugs inattendus.</w:t>
+        <w:t xml:space="preserve">filter</w:t>
+      </w:r>
+      <w:r>
+        <w:t xml:space="preserve">.</w:t>
       </w:r>
     </w:p>
     <w:p>
@@ -355,13 +294,13 @@
       </w:r>
     </w:p>
     <w:bookmarkEnd w:id="20"/>
-    <w:bookmarkStart w:id="21" w:name="instruction-finally"/>
+    <w:bookmarkStart w:id="21" w:name="traitement-avec-filter"/>
     <w:p>
       <w:pPr>
         <w:pStyle w:val="Heading2"/>
       </w:pPr>
       <w:r>
-        <w:t xml:space="preserve">Instruction finally</w:t>
+        <w:t xml:space="preserve">Traitement avec filter</w:t>
       </w:r>
     </w:p>
     <w:p>
@@ -369,7 +308,7 @@
         <w:pStyle w:val="FirstParagraph"/>
       </w:pPr>
       <w:r>
-        <w:t xml:space="preserve">L’instruction</w:t>
+        <w:t xml:space="preserve">La fonction</w:t>
       </w:r>
       <w:r>
         <w:t xml:space="preserve"> </w:t>
@@ -378,13 +317,13 @@
         <w:rPr>
           <w:rStyle w:val="VerbatimChar"/>
         </w:rPr>
-        <w:t xml:space="preserve">finally</w:t>
-      </w:r>
-      <w:r>
-        <w:t xml:space="preserve"> </w:t>
-      </w:r>
-      <w:r>
-        <w:t xml:space="preserve">permet de définir un bloc de code qui s’exécute systématiquement à la fin, qu’une exception ait été levée ou non. Elle est idéale pour libérer des ressources (fichiers, connexions réseau).</w:t>
+        <w:t xml:space="preserve">filter()</w:t>
+      </w:r>
+      <w:r>
+        <w:t xml:space="preserve"> </w:t>
+      </w:r>
+      <w:r>
+        <w:t xml:space="preserve">permet de filtrer les éléments d’une collection en évaluant chaque élément à l’aide d’une fonction conditionnelle qui retourne un booléen.</w:t>
       </w:r>
     </w:p>
     <w:p>
@@ -395,22 +334,100 @@
         <w:rPr>
           <w:rStyle w:val="CommentTok"/>
         </w:rPr>
-        <w:t xml:space="preserve"># Utilisation de finally pour la clôture des ressources</w:t>
+        <w:t xml:space="preserve"># Filtrage des nombres pairs d'une liste</w:t>
       </w:r>
       <w:r>
         <w:br/>
       </w:r>
       <w:r>
         <w:rPr>
-          <w:rStyle w:val="ControlFlowTok"/>
-        </w:rPr>
-        <w:t xml:space="preserve">try</w:t>
-      </w:r>
-      <w:r>
-        <w:rPr>
-          <w:rStyle w:val="NormalTok"/>
-        </w:rPr>
-        <w:t xml:space="preserve">:</w:t>
+          <w:rStyle w:val="NormalTok"/>
+        </w:rPr>
+        <w:t xml:space="preserve">nombres </w:t>
+      </w:r>
+      <w:r>
+        <w:rPr>
+          <w:rStyle w:val="OperatorTok"/>
+        </w:rPr>
+        <w:t xml:space="preserve">=</w:t>
+      </w:r>
+      <w:r>
+        <w:rPr>
+          <w:rStyle w:val="NormalTok"/>
+        </w:rPr>
+        <w:t xml:space="preserve"> [</w:t>
+      </w:r>
+      <w:r>
+        <w:rPr>
+          <w:rStyle w:val="DecValTok"/>
+        </w:rPr>
+        <w:t xml:space="preserve">1</w:t>
+      </w:r>
+      <w:r>
+        <w:rPr>
+          <w:rStyle w:val="NormalTok"/>
+        </w:rPr>
+        <w:t xml:space="preserve">, </w:t>
+      </w:r>
+      <w:r>
+        <w:rPr>
+          <w:rStyle w:val="DecValTok"/>
+        </w:rPr>
+        <w:t xml:space="preserve">2</w:t>
+      </w:r>
+      <w:r>
+        <w:rPr>
+          <w:rStyle w:val="NormalTok"/>
+        </w:rPr>
+        <w:t xml:space="preserve">, </w:t>
+      </w:r>
+      <w:r>
+        <w:rPr>
+          <w:rStyle w:val="DecValTok"/>
+        </w:rPr>
+        <w:t xml:space="preserve">3</w:t>
+      </w:r>
+      <w:r>
+        <w:rPr>
+          <w:rStyle w:val="NormalTok"/>
+        </w:rPr>
+        <w:t xml:space="preserve">, </w:t>
+      </w:r>
+      <w:r>
+        <w:rPr>
+          <w:rStyle w:val="DecValTok"/>
+        </w:rPr>
+        <w:t xml:space="preserve">4</w:t>
+      </w:r>
+      <w:r>
+        <w:rPr>
+          <w:rStyle w:val="NormalTok"/>
+        </w:rPr>
+        <w:t xml:space="preserve">, </w:t>
+      </w:r>
+      <w:r>
+        <w:rPr>
+          <w:rStyle w:val="DecValTok"/>
+        </w:rPr>
+        <w:t xml:space="preserve">5</w:t>
+      </w:r>
+      <w:r>
+        <w:rPr>
+          <w:rStyle w:val="NormalTok"/>
+        </w:rPr>
+        <w:t xml:space="preserve">, </w:t>
+      </w:r>
+      <w:r>
+        <w:rPr>
+          <w:rStyle w:val="DecValTok"/>
+        </w:rPr>
+        <w:t xml:space="preserve">6</w:t>
+      </w:r>
+      <w:r>
+        <w:rPr>
+          <w:rStyle w:val="NormalTok"/>
+        </w:rPr>
+        <w:t xml:space="preserve">]</w:t>
       </w:r>
       <w:r>
         <w:br/>
@@ -419,7 +436,7 @@
         <w:rPr>
           <w:rStyle w:val="NormalTok"/>
         </w:rPr>
-        <w:t xml:space="preserve">    fichier </w:t>
+        <w:t xml:space="preserve">pairs </w:t>
       </w:r>
       <w:r>
         <w:rPr>
@@ -431,61 +448,13 @@
         <w:rPr>
           <w:rStyle w:val="NormalTok"/>
         </w:rPr>
-        <w:t xml:space="preserve"> ouvrir_fichier(</w:t>
-      </w:r>
-      <w:r>
-        <w:rPr>
-          <w:rStyle w:val="StringTok"/>
-        </w:rPr>
-        <w:t xml:space="preserve">"donnees.txt"</w:t>
-      </w:r>
-      <w:r>
-        <w:rPr>
-          <w:rStyle w:val="NormalTok"/>
-        </w:rPr>
-        <w:t xml:space="preserve">)</w:t>
-      </w:r>
-      <w:r>
-        <w:br/>
-      </w:r>
-      <w:r>
-        <w:rPr>
-          <w:rStyle w:val="ControlFlowTok"/>
-        </w:rPr>
-        <w:t xml:space="preserve">except</w:t>
-      </w:r>
-      <w:r>
-        <w:rPr>
-          <w:rStyle w:val="NormalTok"/>
-        </w:rPr>
-        <w:t xml:space="preserve"> </w:t>
-      </w:r>
-      <w:r>
-        <w:rPr>
-          <w:rStyle w:val="PreprocessorTok"/>
-        </w:rPr>
-        <w:t xml:space="preserve">FileNotFoundError</w:t>
-      </w:r>
-      <w:r>
-        <w:rPr>
-          <w:rStyle w:val="NormalTok"/>
-        </w:rPr>
-        <w:t xml:space="preserve">:</w:t>
-      </w:r>
-      <w:r>
-        <w:br/>
-      </w:r>
-      <w:r>
-        <w:rPr>
-          <w:rStyle w:val="NormalTok"/>
-        </w:rPr>
-        <w:t xml:space="preserve">    </w:t>
+        <w:t xml:space="preserve"> </w:t>
       </w:r>
       <w:r>
         <w:rPr>
           <w:rStyle w:val="BuiltInTok"/>
         </w:rPr>
-        <w:t xml:space="preserve">print</w:t>
+        <w:t xml:space="preserve">list</w:t>
       </w:r>
       <w:r>
         <w:rPr>
@@ -495,45 +464,75 @@
       </w:r>
       <w:r>
         <w:rPr>
-          <w:rStyle w:val="StringTok"/>
-        </w:rPr>
-        <w:t xml:space="preserve">"Fichier introuvable"</w:t>
-      </w:r>
-      <w:r>
-        <w:rPr>
-          <w:rStyle w:val="NormalTok"/>
-        </w:rPr>
-        <w:t xml:space="preserve">)</w:t>
-      </w:r>
-      <w:r>
-        <w:br/>
-      </w:r>
-      <w:r>
-        <w:rPr>
-          <w:rStyle w:val="ControlFlowTok"/>
-        </w:rPr>
-        <w:t xml:space="preserve">finally</w:t>
-      </w:r>
-      <w:r>
-        <w:rPr>
-          <w:rStyle w:val="NormalTok"/>
-        </w:rPr>
-        <w:t xml:space="preserve">:</w:t>
-      </w:r>
-      <w:r>
-        <w:br/>
-      </w:r>
-      <w:r>
-        <w:rPr>
-          <w:rStyle w:val="NormalTok"/>
-        </w:rPr>
-        <w:t xml:space="preserve">    fermer_fichier()  </w:t>
-      </w:r>
-      <w:r>
-        <w:rPr>
-          <w:rStyle w:val="CommentTok"/>
-        </w:rPr>
-        <w:t xml:space="preserve"># Exécuté dans tous les cas</w:t>
+          <w:rStyle w:val="BuiltInTok"/>
+        </w:rPr>
+        <w:t xml:space="preserve">filter</w:t>
+      </w:r>
+      <w:r>
+        <w:rPr>
+          <w:rStyle w:val="NormalTok"/>
+        </w:rPr>
+        <w:t xml:space="preserve">(</w:t>
+      </w:r>
+      <w:r>
+        <w:rPr>
+          <w:rStyle w:val="KeywordTok"/>
+        </w:rPr>
+        <w:t xml:space="preserve">lambda</w:t>
+      </w:r>
+      <w:r>
+        <w:rPr>
+          <w:rStyle w:val="NormalTok"/>
+        </w:rPr>
+        <w:t xml:space="preserve"> x: x </w:t>
+      </w:r>
+      <w:r>
+        <w:rPr>
+          <w:rStyle w:val="OperatorTok"/>
+        </w:rPr>
+        <w:t xml:space="preserve">%</w:t>
+      </w:r>
+      <w:r>
+        <w:rPr>
+          <w:rStyle w:val="NormalTok"/>
+        </w:rPr>
+        <w:t xml:space="preserve"> </w:t>
+      </w:r>
+      <w:r>
+        <w:rPr>
+          <w:rStyle w:val="DecValTok"/>
+        </w:rPr>
+        <w:t xml:space="preserve">2</w:t>
+      </w:r>
+      <w:r>
+        <w:rPr>
+          <w:rStyle w:val="NormalTok"/>
+        </w:rPr>
+        <w:t xml:space="preserve"> </w:t>
+      </w:r>
+      <w:r>
+        <w:rPr>
+          <w:rStyle w:val="OperatorTok"/>
+        </w:rPr>
+        <w:t xml:space="preserve">==</w:t>
+      </w:r>
+      <w:r>
+        <w:rPr>
+          <w:rStyle w:val="NormalTok"/>
+        </w:rPr>
+        <w:t xml:space="preserve"> </w:t>
+      </w:r>
+      <w:r>
+        <w:rPr>
+          <w:rStyle w:val="DecValTok"/>
+        </w:rPr>
+        <w:t xml:space="preserve">0</w:t>
+      </w:r>
+      <w:r>
+        <w:rPr>
+          <w:rStyle w:val="NormalTok"/>
+        </w:rPr>
+        <w:t xml:space="preserve">, nombres))</w:t>
       </w:r>
     </w:p>
     <w:p>
@@ -541,7 +540,7 @@
         <w:pStyle w:val="BlockText"/>
       </w:pPr>
       <w:r>
-        <w:t xml:space="preserve">💡 Privilégiez l’utilisation du gestionnaire de contexte</w:t>
+        <w:t xml:space="preserve">💡 Le résultat retourné par</w:t>
       </w:r>
       <w:r>
         <w:t xml:space="preserve"> </w:t>
@@ -550,13 +549,13 @@
         <w:rPr>
           <w:rStyle w:val="VerbatimChar"/>
         </w:rPr>
-        <w:t xml:space="preserve">with</w:t>
-      </w:r>
-      <w:r>
-        <w:t xml:space="preserve"> </w:t>
-      </w:r>
-      <w:r>
-        <w:t xml:space="preserve">lorsque c’est possible pour automatiser le nettoyage des ressources sans recourir explicitement à un bloc</w:t>
+        <w:t xml:space="preserve">filter()</w:t>
+      </w:r>
+      <w:r>
+        <w:t xml:space="preserve"> </w:t>
+      </w:r>
+      <w:r>
+        <w:t xml:space="preserve">en Python est un itérateur, pensez à le convertir explicitement en</w:t>
       </w:r>
       <w:r>
         <w:t xml:space="preserve"> </w:t>
@@ -565,10 +564,28 @@
         <w:rPr>
           <w:rStyle w:val="VerbatimChar"/>
         </w:rPr>
-        <w:t xml:space="preserve">finally</w:t>
-      </w:r>
-      <w:r>
-        <w:t xml:space="preserve">.</w:t>
+        <w:t xml:space="preserve">list</w:t>
+      </w:r>
+      <w:r>
+        <w:t xml:space="preserve"> </w:t>
+      </w:r>
+      <w:r>
+        <w:t xml:space="preserve">ou</w:t>
+      </w:r>
+      <w:r>
+        <w:t xml:space="preserve"> </w:t>
+      </w:r>
+      <w:r>
+        <w:rPr>
+          <w:rStyle w:val="VerbatimChar"/>
+        </w:rPr>
+        <w:t xml:space="preserve">tuple</w:t>
+      </w:r>
+      <w:r>
+        <w:t xml:space="preserve"> </w:t>
+      </w:r>
+      <w:r>
+        <w:t xml:space="preserve">pour exploiter les données.</w:t>
       </w:r>
     </w:p>
     <w:p>
@@ -579,13 +596,13 @@
       </w:r>
     </w:p>
     <w:bookmarkEnd w:id="21"/>
-    <w:bookmarkStart w:id="22" w:name="emettre-une-exception-avec-throw"/>
+    <w:bookmarkStart w:id="22" w:name="traitement-avec-map"/>
     <w:p>
       <w:pPr>
         <w:pStyle w:val="Heading2"/>
       </w:pPr>
       <w:r>
-        <w:t xml:space="preserve">Emettre une exception avec throw</w:t>
+        <w:t xml:space="preserve">Traitement avec map</w:t>
       </w:r>
     </w:p>
     <w:p>
@@ -593,7 +610,7 @@
         <w:pStyle w:val="FirstParagraph"/>
       </w:pPr>
       <w:r>
-        <w:t xml:space="preserve">Il est possible d’émettre volontairement une exception à l’aide de l’instruction</w:t>
+        <w:t xml:space="preserve">La fonction</w:t>
       </w:r>
       <w:r>
         <w:t xml:space="preserve"> </w:t>
@@ -602,13 +619,182 @@
         <w:rPr>
           <w:rStyle w:val="VerbatimChar"/>
         </w:rPr>
-        <w:t xml:space="preserve">raise</w:t>
-      </w:r>
-      <w:r>
-        <w:t xml:space="preserve"> </w:t>
-      </w:r>
-      <w:r>
-        <w:t xml:space="preserve">(similaire à</w:t>
+        <w:t xml:space="preserve">map()</w:t>
+      </w:r>
+      <w:r>
+        <w:t xml:space="preserve"> </w:t>
+      </w:r>
+      <w:r>
+        <w:t xml:space="preserve">applique une fonction spécifique à l’ensemble des éléments d’une collection itérable, transformant ainsi les données en une seule passe.</w:t>
+      </w:r>
+    </w:p>
+    <w:p>
+      <w:pPr>
+        <w:pStyle w:val="SourceCode"/>
+      </w:pPr>
+      <w:r>
+        <w:rPr>
+          <w:rStyle w:val="CommentTok"/>
+        </w:rPr>
+        <w:t xml:space="preserve"># Application d'une transformation pour multiplier par 2 chaque élément</w:t>
+      </w:r>
+      <w:r>
+        <w:br/>
+      </w:r>
+      <w:r>
+        <w:rPr>
+          <w:rStyle w:val="NormalTok"/>
+        </w:rPr>
+        <w:t xml:space="preserve">valeurs </w:t>
+      </w:r>
+      <w:r>
+        <w:rPr>
+          <w:rStyle w:val="OperatorTok"/>
+        </w:rPr>
+        <w:t xml:space="preserve">=</w:t>
+      </w:r>
+      <w:r>
+        <w:rPr>
+          <w:rStyle w:val="NormalTok"/>
+        </w:rPr>
+        <w:t xml:space="preserve"> [</w:t>
+      </w:r>
+      <w:r>
+        <w:rPr>
+          <w:rStyle w:val="DecValTok"/>
+        </w:rPr>
+        <w:t xml:space="preserve">1</w:t>
+      </w:r>
+      <w:r>
+        <w:rPr>
+          <w:rStyle w:val="NormalTok"/>
+        </w:rPr>
+        <w:t xml:space="preserve">, </w:t>
+      </w:r>
+      <w:r>
+        <w:rPr>
+          <w:rStyle w:val="DecValTok"/>
+        </w:rPr>
+        <w:t xml:space="preserve">2</w:t>
+      </w:r>
+      <w:r>
+        <w:rPr>
+          <w:rStyle w:val="NormalTok"/>
+        </w:rPr>
+        <w:t xml:space="preserve">, </w:t>
+      </w:r>
+      <w:r>
+        <w:rPr>
+          <w:rStyle w:val="DecValTok"/>
+        </w:rPr>
+        <w:t xml:space="preserve">3</w:t>
+      </w:r>
+      <w:r>
+        <w:rPr>
+          <w:rStyle w:val="NormalTok"/>
+        </w:rPr>
+        <w:t xml:space="preserve">, </w:t>
+      </w:r>
+      <w:r>
+        <w:rPr>
+          <w:rStyle w:val="DecValTok"/>
+        </w:rPr>
+        <w:t xml:space="preserve">4</w:t>
+      </w:r>
+      <w:r>
+        <w:rPr>
+          <w:rStyle w:val="NormalTok"/>
+        </w:rPr>
+        <w:t xml:space="preserve">]</w:t>
+      </w:r>
+      <w:r>
+        <w:br/>
+      </w:r>
+      <w:r>
+        <w:rPr>
+          <w:rStyle w:val="NormalTok"/>
+        </w:rPr>
+        <w:t xml:space="preserve">doubles </w:t>
+      </w:r>
+      <w:r>
+        <w:rPr>
+          <w:rStyle w:val="OperatorTok"/>
+        </w:rPr>
+        <w:t xml:space="preserve">=</w:t>
+      </w:r>
+      <w:r>
+        <w:rPr>
+          <w:rStyle w:val="NormalTok"/>
+        </w:rPr>
+        <w:t xml:space="preserve"> </w:t>
+      </w:r>
+      <w:r>
+        <w:rPr>
+          <w:rStyle w:val="BuiltInTok"/>
+        </w:rPr>
+        <w:t xml:space="preserve">list</w:t>
+      </w:r>
+      <w:r>
+        <w:rPr>
+          <w:rStyle w:val="NormalTok"/>
+        </w:rPr>
+        <w:t xml:space="preserve">(</w:t>
+      </w:r>
+      <w:r>
+        <w:rPr>
+          <w:rStyle w:val="BuiltInTok"/>
+        </w:rPr>
+        <w:t xml:space="preserve">map</w:t>
+      </w:r>
+      <w:r>
+        <w:rPr>
+          <w:rStyle w:val="NormalTok"/>
+        </w:rPr>
+        <w:t xml:space="preserve">(</w:t>
+      </w:r>
+      <w:r>
+        <w:rPr>
+          <w:rStyle w:val="KeywordTok"/>
+        </w:rPr>
+        <w:t xml:space="preserve">lambda</w:t>
+      </w:r>
+      <w:r>
+        <w:rPr>
+          <w:rStyle w:val="NormalTok"/>
+        </w:rPr>
+        <w:t xml:space="preserve"> x: x </w:t>
+      </w:r>
+      <w:r>
+        <w:rPr>
+          <w:rStyle w:val="OperatorTok"/>
+        </w:rPr>
+        <w:t xml:space="preserve">*</w:t>
+      </w:r>
+      <w:r>
+        <w:rPr>
+          <w:rStyle w:val="NormalTok"/>
+        </w:rPr>
+        <w:t xml:space="preserve"> </w:t>
+      </w:r>
+      <w:r>
+        <w:rPr>
+          <w:rStyle w:val="DecValTok"/>
+        </w:rPr>
+        <w:t xml:space="preserve">2</w:t>
+      </w:r>
+      <w:r>
+        <w:rPr>
+          <w:rStyle w:val="NormalTok"/>
+        </w:rPr>
+        <w:t xml:space="preserve">, valeurs))</w:t>
+      </w:r>
+    </w:p>
+    <w:p>
+      <w:pPr>
+        <w:pStyle w:val="BlockText"/>
+      </w:pPr>
+      <w:r>
+        <w:t xml:space="preserve">💡 Les compréhensions de listes constituent souvent une alternative plus lisible et idiomatique aux fonctions</w:t>
       </w:r>
       <w:r>
         <w:t xml:space="preserve"> </w:t>
@@ -617,161 +803,13 @@
         <w:rPr>
           <w:rStyle w:val="VerbatimChar"/>
         </w:rPr>
-        <w:t xml:space="preserve">throw</w:t>
-      </w:r>
-      <w:r>
-        <w:t xml:space="preserve">) pour signaler qu’une règle métier ou une condition critique n’est pas respectée.</w:t>
-      </w:r>
-    </w:p>
-    <w:p>
-      <w:pPr>
-        <w:pStyle w:val="SourceCode"/>
-      </w:pPr>
-      <w:r>
-        <w:rPr>
-          <w:rStyle w:val="CommentTok"/>
-        </w:rPr>
-        <w:t xml:space="preserve"># Émission d'une exception si l'âge est invalide</w:t>
-      </w:r>
-      <w:r>
-        <w:br/>
-      </w:r>
-      <w:r>
-        <w:rPr>
-          <w:rStyle w:val="NormalTok"/>
-        </w:rPr>
-        <w:t xml:space="preserve">age </w:t>
-      </w:r>
-      <w:r>
-        <w:rPr>
-          <w:rStyle w:val="OperatorTok"/>
-        </w:rPr>
-        <w:t xml:space="preserve">=</w:t>
-      </w:r>
-      <w:r>
-        <w:rPr>
-          <w:rStyle w:val="NormalTok"/>
-        </w:rPr>
-        <w:t xml:space="preserve"> </w:t>
-      </w:r>
-      <w:r>
-        <w:rPr>
-          <w:rStyle w:val="OperatorTok"/>
-        </w:rPr>
-        <w:t xml:space="preserve">-</w:t>
-      </w:r>
-      <w:r>
-        <w:rPr>
-          <w:rStyle w:val="DecValTok"/>
-        </w:rPr>
-        <w:t xml:space="preserve">5</w:t>
-      </w:r>
-      <w:r>
-        <w:br/>
-      </w:r>
-      <w:r>
-        <w:rPr>
-          <w:rStyle w:val="ControlFlowTok"/>
-        </w:rPr>
-        <w:t xml:space="preserve">if</w:t>
-      </w:r>
-      <w:r>
-        <w:rPr>
-          <w:rStyle w:val="NormalTok"/>
-        </w:rPr>
-        <w:t xml:space="preserve"> age </w:t>
-      </w:r>
-      <w:r>
-        <w:rPr>
-          <w:rStyle w:val="OperatorTok"/>
-        </w:rPr>
-        <w:t xml:space="preserve">&lt;</w:t>
-      </w:r>
-      <w:r>
-        <w:rPr>
-          <w:rStyle w:val="NormalTok"/>
-        </w:rPr>
-        <w:t xml:space="preserve"> </w:t>
-      </w:r>
-      <w:r>
-        <w:rPr>
-          <w:rStyle w:val="DecValTok"/>
-        </w:rPr>
-        <w:t xml:space="preserve">0</w:t>
-      </w:r>
-      <w:r>
-        <w:rPr>
-          <w:rStyle w:val="NormalTok"/>
-        </w:rPr>
-        <w:t xml:space="preserve">:</w:t>
-      </w:r>
-      <w:r>
-        <w:br/>
-      </w:r>
-      <w:r>
-        <w:rPr>
-          <w:rStyle w:val="NormalTok"/>
-        </w:rPr>
-        <w:t xml:space="preserve">    </w:t>
-      </w:r>
-      <w:r>
-        <w:rPr>
-          <w:rStyle w:val="ControlFlowTok"/>
-        </w:rPr>
-        <w:t xml:space="preserve">raise</w:t>
-      </w:r>
-      <w:r>
-        <w:rPr>
-          <w:rStyle w:val="NormalTok"/>
-        </w:rPr>
-        <w:t xml:space="preserve"> </w:t>
-      </w:r>
-      <w:r>
-        <w:rPr>
-          <w:rStyle w:val="PreprocessorTok"/>
-        </w:rPr>
-        <w:t xml:space="preserve">ValueError</w:t>
-      </w:r>
-      <w:r>
-        <w:rPr>
-          <w:rStyle w:val="NormalTok"/>
-        </w:rPr>
-        <w:t xml:space="preserve">(</w:t>
-      </w:r>
-      <w:r>
-        <w:rPr>
-          <w:rStyle w:val="StringTok"/>
-        </w:rPr>
-        <w:t xml:space="preserve">"L'âge ne peut pas être négatif"</w:t>
-      </w:r>
-      <w:r>
-        <w:rPr>
-          <w:rStyle w:val="NormalTok"/>
-        </w:rPr>
-        <w:t xml:space="preserve">)</w:t>
-      </w:r>
-    </w:p>
-    <w:p>
-      <w:pPr>
-        <w:pStyle w:val="BlockText"/>
-      </w:pPr>
-      <w:r>
-        <w:t xml:space="preserve">💡 Créez vos propres classes d’exceptions personnalisées en héritant de la classe</w:t>
-      </w:r>
-      <w:r>
-        <w:t xml:space="preserve"> </w:t>
-      </w:r>
-      <w:r>
-        <w:rPr>
-          <w:rStyle w:val="VerbatimChar"/>
-        </w:rPr>
-        <w:t xml:space="preserve">Exception</w:t>
-      </w:r>
-      <w:r>
-        <w:t xml:space="preserve"> </w:t>
-      </w:r>
-      <w:r>
-        <w:t xml:space="preserve">de base pour affiner la gestion des erreurs spécifiques à votre domaine métier.</w:t>
+        <w:t xml:space="preserve">map()</w:t>
+      </w:r>
+      <w:r>
+        <w:t xml:space="preserve"> </w:t>
+      </w:r>
+      <w:r>
+        <w:t xml:space="preserve">en Python.</w:t>
       </w:r>
     </w:p>
     <w:p>
@@ -782,12 +820,272 @@
       </w:r>
     </w:p>
     <w:bookmarkEnd w:id="22"/>
-    <w:bookmarkStart w:id="23" w:name="exemple-de-synthèse"/>
+    <w:bookmarkStart w:id="23" w:name="traitement-avec-reduce"/>
     <w:p>
       <w:pPr>
         <w:pStyle w:val="Heading2"/>
       </w:pPr>
       <w:r>
+        <w:t xml:space="preserve">Traitement avec reduce</w:t>
+      </w:r>
+    </w:p>
+    <w:p>
+      <w:pPr>
+        <w:pStyle w:val="FirstParagraph"/>
+      </w:pPr>
+      <w:r>
+        <w:t xml:space="preserve">La fonction</w:t>
+      </w:r>
+      <w:r>
+        <w:t xml:space="preserve"> </w:t>
+      </w:r>
+      <w:r>
+        <w:rPr>
+          <w:rStyle w:val="VerbatimChar"/>
+        </w:rPr>
+        <w:t xml:space="preserve">reduce()</w:t>
+      </w:r>
+      <w:r>
+        <w:t xml:space="preserve">, issue du module</w:t>
+      </w:r>
+      <w:r>
+        <w:t xml:space="preserve"> </w:t>
+      </w:r>
+      <w:r>
+        <w:rPr>
+          <w:rStyle w:val="VerbatimChar"/>
+        </w:rPr>
+        <w:t xml:space="preserve">functools</w:t>
+      </w:r>
+      <w:r>
+        <w:t xml:space="preserve">, permet de réduire une collection de données à une valeur unique en appliquant cumulativement une fonction binaire de manière séquentielle.</w:t>
+      </w:r>
+    </w:p>
+    <w:p>
+      <w:pPr>
+        <w:pStyle w:val="SourceCode"/>
+      </w:pPr>
+      <w:r>
+        <w:rPr>
+          <w:rStyle w:val="ImportTok"/>
+        </w:rPr>
+        <w:t xml:space="preserve">from</w:t>
+      </w:r>
+      <w:r>
+        <w:rPr>
+          <w:rStyle w:val="NormalTok"/>
+        </w:rPr>
+        <w:t xml:space="preserve"> functools </w:t>
+      </w:r>
+      <w:r>
+        <w:rPr>
+          <w:rStyle w:val="ImportTok"/>
+        </w:rPr>
+        <w:t xml:space="preserve">import</w:t>
+      </w:r>
+      <w:r>
+        <w:rPr>
+          <w:rStyle w:val="NormalTok"/>
+        </w:rPr>
+        <w:t xml:space="preserve"> </w:t>
+      </w:r>
+      <w:r>
+        <w:rPr>
+          <w:rStyle w:val="BuiltInTok"/>
+        </w:rPr>
+        <w:t xml:space="preserve">reduce</w:t>
+      </w:r>
+      <w:r>
+        <w:br/>
+      </w:r>
+      <w:r>
+        <w:br/>
+      </w:r>
+      <w:r>
+        <w:rPr>
+          <w:rStyle w:val="CommentTok"/>
+        </w:rPr>
+        <w:t xml:space="preserve"># Calcul de la somme des éléments d'une liste par réduction</w:t>
+      </w:r>
+      <w:r>
+        <w:br/>
+      </w:r>
+      <w:r>
+        <w:rPr>
+          <w:rStyle w:val="NormalTok"/>
+        </w:rPr>
+        <w:t xml:space="preserve">nombres </w:t>
+      </w:r>
+      <w:r>
+        <w:rPr>
+          <w:rStyle w:val="OperatorTok"/>
+        </w:rPr>
+        <w:t xml:space="preserve">=</w:t>
+      </w:r>
+      <w:r>
+        <w:rPr>
+          <w:rStyle w:val="NormalTok"/>
+        </w:rPr>
+        <w:t xml:space="preserve"> [</w:t>
+      </w:r>
+      <w:r>
+        <w:rPr>
+          <w:rStyle w:val="DecValTok"/>
+        </w:rPr>
+        <w:t xml:space="preserve">1</w:t>
+      </w:r>
+      <w:r>
+        <w:rPr>
+          <w:rStyle w:val="NormalTok"/>
+        </w:rPr>
+        <w:t xml:space="preserve">, </w:t>
+      </w:r>
+      <w:r>
+        <w:rPr>
+          <w:rStyle w:val="DecValTok"/>
+        </w:rPr>
+        <w:t xml:space="preserve">2</w:t>
+      </w:r>
+      <w:r>
+        <w:rPr>
+          <w:rStyle w:val="NormalTok"/>
+        </w:rPr>
+        <w:t xml:space="preserve">, </w:t>
+      </w:r>
+      <w:r>
+        <w:rPr>
+          <w:rStyle w:val="DecValTok"/>
+        </w:rPr>
+        <w:t xml:space="preserve">3</w:t>
+      </w:r>
+      <w:r>
+        <w:rPr>
+          <w:rStyle w:val="NormalTok"/>
+        </w:rPr>
+        <w:t xml:space="preserve">, </w:t>
+      </w:r>
+      <w:r>
+        <w:rPr>
+          <w:rStyle w:val="DecValTok"/>
+        </w:rPr>
+        <w:t xml:space="preserve">4</w:t>
+      </w:r>
+      <w:r>
+        <w:rPr>
+          <w:rStyle w:val="NormalTok"/>
+        </w:rPr>
+        <w:t xml:space="preserve">]</w:t>
+      </w:r>
+      <w:r>
+        <w:br/>
+      </w:r>
+      <w:r>
+        <w:rPr>
+          <w:rStyle w:val="NormalTok"/>
+        </w:rPr>
+        <w:t xml:space="preserve">somme_totale </w:t>
+      </w:r>
+      <w:r>
+        <w:rPr>
+          <w:rStyle w:val="OperatorTok"/>
+        </w:rPr>
+        <w:t xml:space="preserve">=</w:t>
+      </w:r>
+      <w:r>
+        <w:rPr>
+          <w:rStyle w:val="NormalTok"/>
+        </w:rPr>
+        <w:t xml:space="preserve"> </w:t>
+      </w:r>
+      <w:r>
+        <w:rPr>
+          <w:rStyle w:val="BuiltInTok"/>
+        </w:rPr>
+        <w:t xml:space="preserve">reduce</w:t>
+      </w:r>
+      <w:r>
+        <w:rPr>
+          <w:rStyle w:val="NormalTok"/>
+        </w:rPr>
+        <w:t xml:space="preserve">(</w:t>
+      </w:r>
+      <w:r>
+        <w:rPr>
+          <w:rStyle w:val="KeywordTok"/>
+        </w:rPr>
+        <w:t xml:space="preserve">lambda</w:t>
+      </w:r>
+      <w:r>
+        <w:rPr>
+          <w:rStyle w:val="NormalTok"/>
+        </w:rPr>
+        <w:t xml:space="preserve"> x, y: x </w:t>
+      </w:r>
+      <w:r>
+        <w:rPr>
+          <w:rStyle w:val="OperatorTok"/>
+        </w:rPr>
+        <w:t xml:space="preserve">+</w:t>
+      </w:r>
+      <w:r>
+        <w:rPr>
+          <w:rStyle w:val="NormalTok"/>
+        </w:rPr>
+        <w:t xml:space="preserve"> y, nombres)</w:t>
+      </w:r>
+    </w:p>
+    <w:p>
+      <w:pPr>
+        <w:pStyle w:val="BlockText"/>
+      </w:pPr>
+      <w:r>
+        <w:t xml:space="preserve">💡 Pensez à importer</w:t>
+      </w:r>
+      <w:r>
+        <w:t xml:space="preserve"> </w:t>
+      </w:r>
+      <w:r>
+        <w:rPr>
+          <w:rStyle w:val="VerbatimChar"/>
+        </w:rPr>
+        <w:t xml:space="preserve">reduce</w:t>
+      </w:r>
+      <w:r>
+        <w:t xml:space="preserve"> </w:t>
+      </w:r>
+      <w:r>
+        <w:t xml:space="preserve">depuis le module</w:t>
+      </w:r>
+      <w:r>
+        <w:t xml:space="preserve"> </w:t>
+      </w:r>
+      <w:r>
+        <w:rPr>
+          <w:rStyle w:val="VerbatimChar"/>
+        </w:rPr>
+        <w:t xml:space="preserve">functools</w:t>
+      </w:r>
+      <w:r>
+        <w:t xml:space="preserve"> </w:t>
+      </w:r>
+      <w:r>
+        <w:t xml:space="preserve">avant de l’utiliser, car cette fonction n’est plus intégrée directement dans l’espace de noms global de Python.</w:t>
+      </w:r>
+    </w:p>
+    <w:p>
+      <w:r>
+        <w:pict>
+          <v:rect style="width:0;height:1.5pt" o:hralign="center" o:hrstd="t" o:hr="t"/>
+        </w:pict>
+      </w:r>
+    </w:p>
+    <w:bookmarkEnd w:id="23"/>
+    <w:bookmarkStart w:id="24" w:name="exemple-de-synthèse"/>
+    <w:p>
+      <w:pPr>
+        <w:pStyle w:val="Heading2"/>
+      </w:pPr>
+      <w:r>
         <w:t xml:space="preserve">Exemple de synthèse</w:t>
       </w:r>
     </w:p>
@@ -797,42 +1095,231 @@
       </w:pPr>
       <w:r>
         <w:rPr>
+          <w:rStyle w:val="ImportTok"/>
+        </w:rPr>
+        <w:t xml:space="preserve">from</w:t>
+      </w:r>
+      <w:r>
+        <w:rPr>
+          <w:rStyle w:val="NormalTok"/>
+        </w:rPr>
+        <w:t xml:space="preserve"> functools </w:t>
+      </w:r>
+      <w:r>
+        <w:rPr>
+          <w:rStyle w:val="ImportTok"/>
+        </w:rPr>
+        <w:t xml:space="preserve">import</w:t>
+      </w:r>
+      <w:r>
+        <w:rPr>
+          <w:rStyle w:val="NormalTok"/>
+        </w:rPr>
+        <w:t xml:space="preserve"> </w:t>
+      </w:r>
+      <w:r>
+        <w:rPr>
+          <w:rStyle w:val="BuiltInTok"/>
+        </w:rPr>
+        <w:t xml:space="preserve">reduce</w:t>
+      </w:r>
+      <w:r>
+        <w:br/>
+      </w:r>
+      <w:r>
+        <w:br/>
+      </w:r>
+      <w:r>
+        <w:rPr>
           <w:rStyle w:val="CommentTok"/>
         </w:rPr>
-        <w:t xml:space="preserve"># Programme complet combinant try, except, finally et la levée d'une exception avec raise</w:t>
+        <w:t xml:space="preserve"># Programme complet combinant lambda, filter, map et reduce sur une masse de données</w:t>
       </w:r>
       <w:r>
         <w:br/>
       </w:r>
       <w:r>
+        <w:rPr>
+          <w:rStyle w:val="NormalTok"/>
+        </w:rPr>
+        <w:t xml:space="preserve">prix_articles </w:t>
+      </w:r>
+      <w:r>
+        <w:rPr>
+          <w:rStyle w:val="OperatorTok"/>
+        </w:rPr>
+        <w:t xml:space="preserve">=</w:t>
+      </w:r>
+      <w:r>
+        <w:rPr>
+          <w:rStyle w:val="NormalTok"/>
+        </w:rPr>
+        <w:t xml:space="preserve"> [</w:t>
+      </w:r>
+      <w:r>
+        <w:rPr>
+          <w:rStyle w:val="FloatTok"/>
+        </w:rPr>
+        <w:t xml:space="preserve">12.5</w:t>
+      </w:r>
+      <w:r>
+        <w:rPr>
+          <w:rStyle w:val="NormalTok"/>
+        </w:rPr>
+        <w:t xml:space="preserve">, </w:t>
+      </w:r>
+      <w:r>
+        <w:rPr>
+          <w:rStyle w:val="FloatTok"/>
+        </w:rPr>
+        <w:t xml:space="preserve">45.0</w:t>
+      </w:r>
+      <w:r>
+        <w:rPr>
+          <w:rStyle w:val="NormalTok"/>
+        </w:rPr>
+        <w:t xml:space="preserve">, </w:t>
+      </w:r>
+      <w:r>
+        <w:rPr>
+          <w:rStyle w:val="FloatTok"/>
+        </w:rPr>
+        <w:t xml:space="preserve">8.0</w:t>
+      </w:r>
+      <w:r>
+        <w:rPr>
+          <w:rStyle w:val="NormalTok"/>
+        </w:rPr>
+        <w:t xml:space="preserve">, </w:t>
+      </w:r>
+      <w:r>
+        <w:rPr>
+          <w:rStyle w:val="FloatTok"/>
+        </w:rPr>
+        <w:t xml:space="preserve">100.0</w:t>
+      </w:r>
+      <w:r>
+        <w:rPr>
+          <w:rStyle w:val="NormalTok"/>
+        </w:rPr>
+        <w:t xml:space="preserve">, </w:t>
+      </w:r>
+      <w:r>
+        <w:rPr>
+          <w:rStyle w:val="FloatTok"/>
+        </w:rPr>
+        <w:t xml:space="preserve">32.5</w:t>
+      </w:r>
+      <w:r>
+        <w:rPr>
+          <w:rStyle w:val="NormalTok"/>
+        </w:rPr>
+        <w:t xml:space="preserve">]</w:t>
+      </w:r>
+      <w:r>
         <w:br/>
       </w:r>
       <w:r>
+        <w:br/>
+      </w:r>
+      <w:r>
+        <w:rPr>
+          <w:rStyle w:val="CommentTok"/>
+        </w:rPr>
+        <w:t xml:space="preserve"># 1. Filtrer les articles dont le prix est supérieur à 15.0 via filter et lambda</w:t>
+      </w:r>
+      <w:r>
+        <w:br/>
+      </w:r>
+      <w:r>
+        <w:rPr>
+          <w:rStyle w:val="NormalTok"/>
+        </w:rPr>
+        <w:t xml:space="preserve">articles_cibles </w:t>
+      </w:r>
+      <w:r>
+        <w:rPr>
+          <w:rStyle w:val="OperatorTok"/>
+        </w:rPr>
+        <w:t xml:space="preserve">=</w:t>
+      </w:r>
+      <w:r>
+        <w:rPr>
+          <w:rStyle w:val="NormalTok"/>
+        </w:rPr>
+        <w:t xml:space="preserve"> </w:t>
+      </w:r>
+      <w:r>
+        <w:rPr>
+          <w:rStyle w:val="BuiltInTok"/>
+        </w:rPr>
+        <w:t xml:space="preserve">list</w:t>
+      </w:r>
+      <w:r>
+        <w:rPr>
+          <w:rStyle w:val="NormalTok"/>
+        </w:rPr>
+        <w:t xml:space="preserve">(</w:t>
+      </w:r>
+      <w:r>
+        <w:rPr>
+          <w:rStyle w:val="BuiltInTok"/>
+        </w:rPr>
+        <w:t xml:space="preserve">filter</w:t>
+      </w:r>
+      <w:r>
+        <w:rPr>
+          <w:rStyle w:val="NormalTok"/>
+        </w:rPr>
+        <w:t xml:space="preserve">(</w:t>
+      </w:r>
+      <w:r>
         <w:rPr>
           <w:rStyle w:val="KeywordTok"/>
         </w:rPr>
-        <w:t xml:space="preserve">def</w:t>
-      </w:r>
-      <w:r>
-        <w:rPr>
-          <w:rStyle w:val="NormalTok"/>
-        </w:rPr>
-        <w:t xml:space="preserve"> convertir_et_diviser(valeur_str, diviseur_str):</w:t>
+        <w:t xml:space="preserve">lambda</w:t>
+      </w:r>
+      <w:r>
+        <w:rPr>
+          <w:rStyle w:val="NormalTok"/>
+        </w:rPr>
+        <w:t xml:space="preserve"> p: p </w:t>
+      </w:r>
+      <w:r>
+        <w:rPr>
+          <w:rStyle w:val="OperatorTok"/>
+        </w:rPr>
+        <w:t xml:space="preserve">&gt;</w:t>
+      </w:r>
+      <w:r>
+        <w:rPr>
+          <w:rStyle w:val="NormalTok"/>
+        </w:rPr>
+        <w:t xml:space="preserve"> </w:t>
+      </w:r>
+      <w:r>
+        <w:rPr>
+          <w:rStyle w:val="FloatTok"/>
+        </w:rPr>
+        <w:t xml:space="preserve">15.0</w:t>
+      </w:r>
+      <w:r>
+        <w:rPr>
+          <w:rStyle w:val="NormalTok"/>
+        </w:rPr>
+        <w:t xml:space="preserve">, prix_articles))</w:t>
       </w:r>
       <w:r>
         <w:br/>
       </w:r>
       <w:r>
-        <w:rPr>
-          <w:rStyle w:val="NormalTok"/>
-        </w:rPr>
-        <w:t xml:space="preserve">    </w:t>
+        <w:br/>
       </w:r>
       <w:r>
         <w:rPr>
           <w:rStyle w:val="CommentTok"/>
         </w:rPr>
-        <w:t xml:space="preserve">"""Convertit deux chaînes en entiers et réalise une division sécurisée."""</w:t>
+        <w:t xml:space="preserve"># 2. Appliquer une remise de 10% sur ces articles via map et lambda</w:t>
       </w:r>
       <w:r>
         <w:br/>
@@ -841,28 +1328,100 @@
         <w:rPr>
           <w:rStyle w:val="NormalTok"/>
         </w:rPr>
-        <w:t xml:space="preserve">    </w:t>
-      </w:r>
-      <w:r>
-        <w:rPr>
-          <w:rStyle w:val="ControlFlowTok"/>
-        </w:rPr>
-        <w:t xml:space="preserve">try</w:t>
-      </w:r>
-      <w:r>
-        <w:rPr>
-          <w:rStyle w:val="NormalTok"/>
-        </w:rPr>
-        <w:t xml:space="preserve">:</w:t>
+        <w:t xml:space="preserve">prix_remises </w:t>
+      </w:r>
+      <w:r>
+        <w:rPr>
+          <w:rStyle w:val="OperatorTok"/>
+        </w:rPr>
+        <w:t xml:space="preserve">=</w:t>
+      </w:r>
+      <w:r>
+        <w:rPr>
+          <w:rStyle w:val="NormalTok"/>
+        </w:rPr>
+        <w:t xml:space="preserve"> </w:t>
+      </w:r>
+      <w:r>
+        <w:rPr>
+          <w:rStyle w:val="BuiltInTok"/>
+        </w:rPr>
+        <w:t xml:space="preserve">list</w:t>
+      </w:r>
+      <w:r>
+        <w:rPr>
+          <w:rStyle w:val="NormalTok"/>
+        </w:rPr>
+        <w:t xml:space="preserve">(</w:t>
+      </w:r>
+      <w:r>
+        <w:rPr>
+          <w:rStyle w:val="BuiltInTok"/>
+        </w:rPr>
+        <w:t xml:space="preserve">map</w:t>
+      </w:r>
+      <w:r>
+        <w:rPr>
+          <w:rStyle w:val="NormalTok"/>
+        </w:rPr>
+        <w:t xml:space="preserve">(</w:t>
+      </w:r>
+      <w:r>
+        <w:rPr>
+          <w:rStyle w:val="KeywordTok"/>
+        </w:rPr>
+        <w:t xml:space="preserve">lambda</w:t>
+      </w:r>
+      <w:r>
+        <w:rPr>
+          <w:rStyle w:val="NormalTok"/>
+        </w:rPr>
+        <w:t xml:space="preserve"> p: p </w:t>
+      </w:r>
+      <w:r>
+        <w:rPr>
+          <w:rStyle w:val="OperatorTok"/>
+        </w:rPr>
+        <w:t xml:space="preserve">*</w:t>
+      </w:r>
+      <w:r>
+        <w:rPr>
+          <w:rStyle w:val="NormalTok"/>
+        </w:rPr>
+        <w:t xml:space="preserve"> </w:t>
+      </w:r>
+      <w:r>
+        <w:rPr>
+          <w:rStyle w:val="FloatTok"/>
+        </w:rPr>
+        <w:t xml:space="preserve">0.9</w:t>
+      </w:r>
+      <w:r>
+        <w:rPr>
+          <w:rStyle w:val="NormalTok"/>
+        </w:rPr>
+        <w:t xml:space="preserve">, articles_cibles))</w:t>
       </w:r>
       <w:r>
         <w:br/>
       </w:r>
       <w:r>
-        <w:rPr>
-          <w:rStyle w:val="NormalTok"/>
-        </w:rPr>
-        <w:t xml:space="preserve">        valeur </w:t>
+        <w:br/>
+      </w:r>
+      <w:r>
+        <w:rPr>
+          <w:rStyle w:val="CommentTok"/>
+        </w:rPr>
+        <w:t xml:space="preserve"># 3. Calculer le montant total cumulé de ces articles via reduce et lambda</w:t>
+      </w:r>
+      <w:r>
+        <w:br/>
+      </w:r>
+      <w:r>
+        <w:rPr>
+          <w:rStyle w:val="NormalTok"/>
+        </w:rPr>
+        <w:t xml:space="preserve">montant_global </w:t>
       </w:r>
       <w:r>
         <w:rPr>
@@ -880,142 +1439,112 @@
         <w:rPr>
           <w:rStyle w:val="BuiltInTok"/>
         </w:rPr>
-        <w:t xml:space="preserve">int</w:t>
-      </w:r>
-      <w:r>
-        <w:rPr>
-          <w:rStyle w:val="NormalTok"/>
-        </w:rPr>
-        <w:t xml:space="preserve">(valeur_str)</w:t>
+        <w:t xml:space="preserve">reduce</w:t>
+      </w:r>
+      <w:r>
+        <w:rPr>
+          <w:rStyle w:val="NormalTok"/>
+        </w:rPr>
+        <w:t xml:space="preserve">(</w:t>
+      </w:r>
+      <w:r>
+        <w:rPr>
+          <w:rStyle w:val="KeywordTok"/>
+        </w:rPr>
+        <w:t xml:space="preserve">lambda</w:t>
+      </w:r>
+      <w:r>
+        <w:rPr>
+          <w:rStyle w:val="NormalTok"/>
+        </w:rPr>
+        <w:t xml:space="preserve"> total, p: total </w:t>
+      </w:r>
+      <w:r>
+        <w:rPr>
+          <w:rStyle w:val="OperatorTok"/>
+        </w:rPr>
+        <w:t xml:space="preserve">+</w:t>
+      </w:r>
+      <w:r>
+        <w:rPr>
+          <w:rStyle w:val="NormalTok"/>
+        </w:rPr>
+        <w:t xml:space="preserve"> p, prix_remises, </w:t>
+      </w:r>
+      <w:r>
+        <w:rPr>
+          <w:rStyle w:val="FloatTok"/>
+        </w:rPr>
+        <w:t xml:space="preserve">0.0</w:t>
+      </w:r>
+      <w:r>
+        <w:rPr>
+          <w:rStyle w:val="NormalTok"/>
+        </w:rPr>
+        <w:t xml:space="preserve">)</w:t>
       </w:r>
       <w:r>
         <w:br/>
       </w:r>
       <w:r>
-        <w:rPr>
-          <w:rStyle w:val="NormalTok"/>
-        </w:rPr>
-        <w:t xml:space="preserve">        diviseur </w:t>
-      </w:r>
-      <w:r>
-        <w:rPr>
-          <w:rStyle w:val="OperatorTok"/>
-        </w:rPr>
-        <w:t xml:space="preserve">=</w:t>
-      </w:r>
-      <w:r>
-        <w:rPr>
-          <w:rStyle w:val="NormalTok"/>
-        </w:rPr>
-        <w:t xml:space="preserve"> </w:t>
+        <w:br/>
       </w:r>
       <w:r>
         <w:rPr>
           <w:rStyle w:val="BuiltInTok"/>
         </w:rPr>
-        <w:t xml:space="preserve">int</w:t>
-      </w:r>
-      <w:r>
-        <w:rPr>
-          <w:rStyle w:val="NormalTok"/>
-        </w:rPr>
-        <w:t xml:space="preserve">(diviseur_str)</w:t>
+        <w:t xml:space="preserve">print</w:t>
+      </w:r>
+      <w:r>
+        <w:rPr>
+          <w:rStyle w:val="NormalTok"/>
+        </w:rPr>
+        <w:t xml:space="preserve">(</w:t>
+      </w:r>
+      <w:r>
+        <w:rPr>
+          <w:rStyle w:val="SpecialStringTok"/>
+        </w:rPr>
+        <w:t xml:space="preserve">f"Articles remisés : </w:t>
+      </w:r>
+      <w:r>
+        <w:rPr>
+          <w:rStyle w:val="SpecialCharTok"/>
+        </w:rPr>
+        <w:t xml:space="preserve">{</w:t>
+      </w:r>
+      <w:r>
+        <w:rPr>
+          <w:rStyle w:val="NormalTok"/>
+        </w:rPr>
+        <w:t xml:space="preserve">prix_remises</w:t>
+      </w:r>
+      <w:r>
+        <w:rPr>
+          <w:rStyle w:val="SpecialCharTok"/>
+        </w:rPr>
+        <w:t xml:space="preserve">}</w:t>
+      </w:r>
+      <w:r>
+        <w:rPr>
+          <w:rStyle w:val="SpecialStringTok"/>
+        </w:rPr>
+        <w:t xml:space="preserve">"</w:t>
+      </w:r>
+      <w:r>
+        <w:rPr>
+          <w:rStyle w:val="NormalTok"/>
+        </w:rPr>
+        <w:t xml:space="preserve">)</w:t>
       </w:r>
       <w:r>
         <w:br/>
       </w:r>
       <w:r>
         <w:rPr>
-          <w:rStyle w:val="NormalTok"/>
-        </w:rPr>
-        <w:t xml:space="preserve">        </w:t>
-      </w:r>
-      <w:r>
-        <w:br/>
-      </w:r>
-      <w:r>
-        <w:rPr>
-          <w:rStyle w:val="NormalTok"/>
-        </w:rPr>
-        <w:t xml:space="preserve">        </w:t>
-      </w:r>
-      <w:r>
-        <w:rPr>
-          <w:rStyle w:val="CommentTok"/>
-        </w:rPr>
-        <w:t xml:space="preserve"># Émission d'une exception personnalisée si le diviseur est nul</w:t>
-      </w:r>
-      <w:r>
-        <w:br/>
-      </w:r>
-      <w:r>
-        <w:rPr>
-          <w:rStyle w:val="NormalTok"/>
-        </w:rPr>
-        <w:t xml:space="preserve">        </w:t>
-      </w:r>
-      <w:r>
-        <w:rPr>
-          <w:rStyle w:val="ControlFlowTok"/>
-        </w:rPr>
-        <w:t xml:space="preserve">if</w:t>
-      </w:r>
-      <w:r>
-        <w:rPr>
-          <w:rStyle w:val="NormalTok"/>
-        </w:rPr>
-        <w:t xml:space="preserve"> diviseur </w:t>
-      </w:r>
-      <w:r>
-        <w:rPr>
-          <w:rStyle w:val="OperatorTok"/>
-        </w:rPr>
-        <w:t xml:space="preserve">==</w:t>
-      </w:r>
-      <w:r>
-        <w:rPr>
-          <w:rStyle w:val="NormalTok"/>
-        </w:rPr>
-        <w:t xml:space="preserve"> </w:t>
-      </w:r>
-      <w:r>
-        <w:rPr>
-          <w:rStyle w:val="DecValTok"/>
-        </w:rPr>
-        <w:t xml:space="preserve">0</w:t>
-      </w:r>
-      <w:r>
-        <w:rPr>
-          <w:rStyle w:val="NormalTok"/>
-        </w:rPr>
-        <w:t xml:space="preserve">:</w:t>
-      </w:r>
-      <w:r>
-        <w:br/>
-      </w:r>
-      <w:r>
-        <w:rPr>
-          <w:rStyle w:val="NormalTok"/>
-        </w:rPr>
-        <w:t xml:space="preserve">            </w:t>
-      </w:r>
-      <w:r>
-        <w:rPr>
-          <w:rStyle w:val="ControlFlowTok"/>
-        </w:rPr>
-        <w:t xml:space="preserve">raise</w:t>
-      </w:r>
-      <w:r>
-        <w:rPr>
-          <w:rStyle w:val="NormalTok"/>
-        </w:rPr>
-        <w:t xml:space="preserve"> </w:t>
-      </w:r>
-      <w:r>
-        <w:rPr>
-          <w:rStyle w:val="PreprocessorTok"/>
-        </w:rPr>
-        <w:t xml:space="preserve">ZeroDivisionError</w:t>
+          <w:rStyle w:val="BuiltInTok"/>
+        </w:rPr>
+        <w:t xml:space="preserve">print</w:t>
       </w:r>
       <w:r>
         <w:rPr>
@@ -1025,9 +1554,33 @@
       </w:r>
       <w:r>
         <w:rPr>
-          <w:rStyle w:val="StringTok"/>
-        </w:rPr>
-        <w:t xml:space="preserve">"Le diviseur ne peut pas être égal à zéro."</w:t>
+          <w:rStyle w:val="SpecialStringTok"/>
+        </w:rPr>
+        <w:t xml:space="preserve">f"Montant global de la commande : </w:t>
+      </w:r>
+      <w:r>
+        <w:rPr>
+          <w:rStyle w:val="SpecialCharTok"/>
+        </w:rPr>
+        <w:t xml:space="preserve">{</w:t>
+      </w:r>
+      <w:r>
+        <w:rPr>
+          <w:rStyle w:val="NormalTok"/>
+        </w:rPr>
+        <w:t xml:space="preserve">montant_global</w:t>
+      </w:r>
+      <w:r>
+        <w:rPr>
+          <w:rStyle w:val="SpecialCharTok"/>
+        </w:rPr>
+        <w:t xml:space="preserve">:.2f}</w:t>
+      </w:r>
+      <w:r>
+        <w:rPr>
+          <w:rStyle w:val="SpecialStringTok"/>
+        </w:rPr>
+        <w:t xml:space="preserve"> €"</w:t>
       </w:r>
       <w:r>
         <w:rPr>
@@ -1035,447 +1588,9 @@
         </w:rPr>
         <w:t xml:space="preserve">)</w:t>
       </w:r>
-      <w:r>
-        <w:br/>
-      </w:r>
-      <w:r>
-        <w:rPr>
-          <w:rStyle w:val="NormalTok"/>
-        </w:rPr>
-        <w:t xml:space="preserve">            </w:t>
-      </w:r>
-      <w:r>
-        <w:br/>
-      </w:r>
-      <w:r>
-        <w:rPr>
-          <w:rStyle w:val="NormalTok"/>
-        </w:rPr>
-        <w:t xml:space="preserve">        quotient </w:t>
-      </w:r>
-      <w:r>
-        <w:rPr>
-          <w:rStyle w:val="OperatorTok"/>
-        </w:rPr>
-        <w:t xml:space="preserve">=</w:t>
-      </w:r>
-      <w:r>
-        <w:rPr>
-          <w:rStyle w:val="NormalTok"/>
-        </w:rPr>
-        <w:t xml:space="preserve"> valeur </w:t>
-      </w:r>
-      <w:r>
-        <w:rPr>
-          <w:rStyle w:val="OperatorTok"/>
-        </w:rPr>
-        <w:t xml:space="preserve">/</w:t>
-      </w:r>
-      <w:r>
-        <w:rPr>
-          <w:rStyle w:val="NormalTok"/>
-        </w:rPr>
-        <w:t xml:space="preserve"> diviseur</w:t>
-      </w:r>
-      <w:r>
-        <w:br/>
-      </w:r>
-      <w:r>
-        <w:rPr>
-          <w:rStyle w:val="NormalTok"/>
-        </w:rPr>
-        <w:t xml:space="preserve">    </w:t>
-      </w:r>
-      <w:r>
-        <w:rPr>
-          <w:rStyle w:val="ControlFlowTok"/>
-        </w:rPr>
-        <w:t xml:space="preserve">except</w:t>
-      </w:r>
-      <w:r>
-        <w:rPr>
-          <w:rStyle w:val="NormalTok"/>
-        </w:rPr>
-        <w:t xml:space="preserve"> </w:t>
-      </w:r>
-      <w:r>
-        <w:rPr>
-          <w:rStyle w:val="PreprocessorTok"/>
-        </w:rPr>
-        <w:t xml:space="preserve">ValueError</w:t>
-      </w:r>
-      <w:r>
-        <w:rPr>
-          <w:rStyle w:val="NormalTok"/>
-        </w:rPr>
-        <w:t xml:space="preserve"> </w:t>
-      </w:r>
-      <w:r>
-        <w:rPr>
-          <w:rStyle w:val="ImportTok"/>
-        </w:rPr>
-        <w:t xml:space="preserve">as</w:t>
-      </w:r>
-      <w:r>
-        <w:rPr>
-          <w:rStyle w:val="NormalTok"/>
-        </w:rPr>
-        <w:t xml:space="preserve"> e:</w:t>
-      </w:r>
-      <w:r>
-        <w:br/>
-      </w:r>
-      <w:r>
-        <w:rPr>
-          <w:rStyle w:val="NormalTok"/>
-        </w:rPr>
-        <w:t xml:space="preserve">        </w:t>
-      </w:r>
-      <w:r>
-        <w:rPr>
-          <w:rStyle w:val="ControlFlowTok"/>
-        </w:rPr>
-        <w:t xml:space="preserve">return</w:t>
-      </w:r>
-      <w:r>
-        <w:rPr>
-          <w:rStyle w:val="NormalTok"/>
-        </w:rPr>
-        <w:t xml:space="preserve"> </w:t>
-      </w:r>
-      <w:r>
-        <w:rPr>
-          <w:rStyle w:val="SpecialStringTok"/>
-        </w:rPr>
-        <w:t xml:space="preserve">f"Erreur de format numérique : </w:t>
-      </w:r>
-      <w:r>
-        <w:rPr>
-          <w:rStyle w:val="SpecialCharTok"/>
-        </w:rPr>
-        <w:t xml:space="preserve">{</w:t>
-      </w:r>
-      <w:r>
-        <w:rPr>
-          <w:rStyle w:val="NormalTok"/>
-        </w:rPr>
-        <w:t xml:space="preserve">e</w:t>
-      </w:r>
-      <w:r>
-        <w:rPr>
-          <w:rStyle w:val="SpecialCharTok"/>
-        </w:rPr>
-        <w:t xml:space="preserve">}</w:t>
-      </w:r>
-      <w:r>
-        <w:rPr>
-          <w:rStyle w:val="SpecialStringTok"/>
-        </w:rPr>
-        <w:t xml:space="preserve">"</w:t>
-      </w:r>
-      <w:r>
-        <w:br/>
-      </w:r>
-      <w:r>
-        <w:rPr>
-          <w:rStyle w:val="NormalTok"/>
-        </w:rPr>
-        <w:t xml:space="preserve">    </w:t>
-      </w:r>
-      <w:r>
-        <w:rPr>
-          <w:rStyle w:val="ControlFlowTok"/>
-        </w:rPr>
-        <w:t xml:space="preserve">except</w:t>
-      </w:r>
-      <w:r>
-        <w:rPr>
-          <w:rStyle w:val="NormalTok"/>
-        </w:rPr>
-        <w:t xml:space="preserve"> </w:t>
-      </w:r>
-      <w:r>
-        <w:rPr>
-          <w:rStyle w:val="PreprocessorTok"/>
-        </w:rPr>
-        <w:t xml:space="preserve">ZeroDivisionError</w:t>
-      </w:r>
-      <w:r>
-        <w:rPr>
-          <w:rStyle w:val="NormalTok"/>
-        </w:rPr>
-        <w:t xml:space="preserve"> </w:t>
-      </w:r>
-      <w:r>
-        <w:rPr>
-          <w:rStyle w:val="ImportTok"/>
-        </w:rPr>
-        <w:t xml:space="preserve">as</w:t>
-      </w:r>
-      <w:r>
-        <w:rPr>
-          <w:rStyle w:val="NormalTok"/>
-        </w:rPr>
-        <w:t xml:space="preserve"> e:</w:t>
-      </w:r>
-      <w:r>
-        <w:br/>
-      </w:r>
-      <w:r>
-        <w:rPr>
-          <w:rStyle w:val="NormalTok"/>
-        </w:rPr>
-        <w:t xml:space="preserve">        </w:t>
-      </w:r>
-      <w:r>
-        <w:rPr>
-          <w:rStyle w:val="ControlFlowTok"/>
-        </w:rPr>
-        <w:t xml:space="preserve">return</w:t>
-      </w:r>
-      <w:r>
-        <w:rPr>
-          <w:rStyle w:val="NormalTok"/>
-        </w:rPr>
-        <w:t xml:space="preserve"> </w:t>
-      </w:r>
-      <w:r>
-        <w:rPr>
-          <w:rStyle w:val="SpecialStringTok"/>
-        </w:rPr>
-        <w:t xml:space="preserve">f"Erreur mathématique : </w:t>
-      </w:r>
-      <w:r>
-        <w:rPr>
-          <w:rStyle w:val="SpecialCharTok"/>
-        </w:rPr>
-        <w:t xml:space="preserve">{</w:t>
-      </w:r>
-      <w:r>
-        <w:rPr>
-          <w:rStyle w:val="NormalTok"/>
-        </w:rPr>
-        <w:t xml:space="preserve">e</w:t>
-      </w:r>
-      <w:r>
-        <w:rPr>
-          <w:rStyle w:val="SpecialCharTok"/>
-        </w:rPr>
-        <w:t xml:space="preserve">}</w:t>
-      </w:r>
-      <w:r>
-        <w:rPr>
-          <w:rStyle w:val="SpecialStringTok"/>
-        </w:rPr>
-        <w:t xml:space="preserve">"</w:t>
-      </w:r>
-      <w:r>
-        <w:br/>
-      </w:r>
-      <w:r>
-        <w:rPr>
-          <w:rStyle w:val="NormalTok"/>
-        </w:rPr>
-        <w:t xml:space="preserve">    </w:t>
-      </w:r>
-      <w:r>
-        <w:rPr>
-          <w:rStyle w:val="ControlFlowTok"/>
-        </w:rPr>
-        <w:t xml:space="preserve">finally</w:t>
-      </w:r>
-      <w:r>
-        <w:rPr>
-          <w:rStyle w:val="NormalTok"/>
-        </w:rPr>
-        <w:t xml:space="preserve">:</w:t>
-      </w:r>
-      <w:r>
-        <w:br/>
-      </w:r>
-      <w:r>
-        <w:rPr>
-          <w:rStyle w:val="NormalTok"/>
-        </w:rPr>
-        <w:t xml:space="preserve">        </w:t>
-      </w:r>
-      <w:r>
-        <w:rPr>
-          <w:rStyle w:val="BuiltInTok"/>
-        </w:rPr>
-        <w:t xml:space="preserve">print</w:t>
-      </w:r>
-      <w:r>
-        <w:rPr>
-          <w:rStyle w:val="NormalTok"/>
-        </w:rPr>
-        <w:t xml:space="preserve">(</w:t>
-      </w:r>
-      <w:r>
-        <w:rPr>
-          <w:rStyle w:val="StringTok"/>
-        </w:rPr>
-        <w:t xml:space="preserve">"Fin de l'opération de calcul sécurisée."</w:t>
-      </w:r>
-      <w:r>
-        <w:rPr>
-          <w:rStyle w:val="NormalTok"/>
-        </w:rPr>
-        <w:t xml:space="preserve">)</w:t>
-      </w:r>
-      <w:r>
-        <w:br/>
-      </w:r>
-      <w:r>
-        <w:rPr>
-          <w:rStyle w:val="NormalTok"/>
-        </w:rPr>
-        <w:t xml:space="preserve">        </w:t>
-      </w:r>
-      <w:r>
-        <w:br/>
-      </w:r>
-      <w:r>
-        <w:rPr>
-          <w:rStyle w:val="NormalTok"/>
-        </w:rPr>
-        <w:t xml:space="preserve">    </w:t>
-      </w:r>
-      <w:r>
-        <w:rPr>
-          <w:rStyle w:val="ControlFlowTok"/>
-        </w:rPr>
-        <w:t xml:space="preserve">return</w:t>
-      </w:r>
-      <w:r>
-        <w:rPr>
-          <w:rStyle w:val="NormalTok"/>
-        </w:rPr>
-        <w:t xml:space="preserve"> </w:t>
-      </w:r>
-      <w:r>
-        <w:rPr>
-          <w:rStyle w:val="SpecialStringTok"/>
-        </w:rPr>
-        <w:t xml:space="preserve">f"Résultat du calcul : </w:t>
-      </w:r>
-      <w:r>
-        <w:rPr>
-          <w:rStyle w:val="SpecialCharTok"/>
-        </w:rPr>
-        <w:t xml:space="preserve">{</w:t>
-      </w:r>
-      <w:r>
-        <w:rPr>
-          <w:rStyle w:val="NormalTok"/>
-        </w:rPr>
-        <w:t xml:space="preserve">quotient</w:t>
-      </w:r>
-      <w:r>
-        <w:rPr>
-          <w:rStyle w:val="SpecialCharTok"/>
-        </w:rPr>
-        <w:t xml:space="preserve">}</w:t>
-      </w:r>
-      <w:r>
-        <w:rPr>
-          <w:rStyle w:val="SpecialStringTok"/>
-        </w:rPr>
-        <w:t xml:space="preserve">"</w:t>
-      </w:r>
-      <w:r>
-        <w:br/>
-      </w:r>
-      <w:r>
-        <w:br/>
-      </w:r>
-      <w:r>
-        <w:rPr>
-          <w:rStyle w:val="CommentTok"/>
-        </w:rPr>
-        <w:t xml:space="preserve"># Test de la fonction avec des valeurs littérales</w:t>
-      </w:r>
-      <w:r>
-        <w:br/>
-      </w:r>
-      <w:r>
-        <w:rPr>
-          <w:rStyle w:val="BuiltInTok"/>
-        </w:rPr>
-        <w:t xml:space="preserve">print</w:t>
-      </w:r>
-      <w:r>
-        <w:rPr>
-          <w:rStyle w:val="NormalTok"/>
-        </w:rPr>
-        <w:t xml:space="preserve">(convertir_et_diviser(</w:t>
-      </w:r>
-      <w:r>
-        <w:rPr>
-          <w:rStyle w:val="StringTok"/>
-        </w:rPr>
-        <w:t xml:space="preserve">"100"</w:t>
-      </w:r>
-      <w:r>
-        <w:rPr>
-          <w:rStyle w:val="NormalTok"/>
-        </w:rPr>
-        <w:t xml:space="preserve">, </w:t>
-      </w:r>
-      <w:r>
-        <w:rPr>
-          <w:rStyle w:val="StringTok"/>
-        </w:rPr>
-        <w:t xml:space="preserve">"4"</w:t>
-      </w:r>
-      <w:r>
-        <w:rPr>
-          <w:rStyle w:val="NormalTok"/>
-        </w:rPr>
-        <w:t xml:space="preserve">))</w:t>
-      </w:r>
-      <w:r>
-        <w:br/>
-      </w:r>
-      <w:r>
-        <w:rPr>
-          <w:rStyle w:val="BuiltInTok"/>
-        </w:rPr>
-        <w:t xml:space="preserve">print</w:t>
-      </w:r>
-      <w:r>
-        <w:rPr>
-          <w:rStyle w:val="NormalTok"/>
-        </w:rPr>
-        <w:t xml:space="preserve">(convertir_et_diviser(</w:t>
-      </w:r>
-      <w:r>
-        <w:rPr>
-          <w:rStyle w:val="StringTok"/>
-        </w:rPr>
-        <w:t xml:space="preserve">"50"</w:t>
-      </w:r>
-      <w:r>
-        <w:rPr>
-          <w:rStyle w:val="NormalTok"/>
-        </w:rPr>
-        <w:t xml:space="preserve">, </w:t>
-      </w:r>
-      <w:r>
-        <w:rPr>
-          <w:rStyle w:val="StringTok"/>
-        </w:rPr>
-        <w:t xml:space="preserve">"0"</w:t>
-      </w:r>
-      <w:r>
-        <w:rPr>
-          <w:rStyle w:val="NormalTok"/>
-        </w:rPr>
-        <w:t xml:space="preserve">))</w:t>
-      </w:r>
-    </w:p>
-    <w:bookmarkEnd w:id="23"/>
-    <w:bookmarkStart w:id="24" w:name="exercices"/>
+    </w:p>
+    <w:bookmarkEnd w:id="24"/>
+    <w:bookmarkStart w:id="25" w:name="exercices"/>
     <w:p>
       <w:pPr>
         <w:pStyle w:val="Heading2"/>
@@ -1503,7 +1618,7 @@
         <w:t xml:space="preserve"> </w:t>
       </w:r>
       <w:r>
-        <w:t xml:space="preserve">Écrivez un script qui demande à l’utilisateur de saisir un nombre, utilise un bloc</w:t>
+        <w:t xml:space="preserve">Utilisez la fonction</w:t>
       </w:r>
       <w:r>
         <w:t xml:space="preserve"> </w:t>
@@ -1512,22 +1627,28 @@
         <w:rPr>
           <w:rStyle w:val="VerbatimChar"/>
         </w:rPr>
-        <w:t xml:space="preserve">try...except</w:t>
-      </w:r>
-      <w:r>
-        <w:t xml:space="preserve"> </w:t>
-      </w:r>
-      <w:r>
-        <w:t xml:space="preserve">pour intercepter une éventuelle erreur de saisie (</w:t>
+        <w:t xml:space="preserve">filter()</w:t>
+      </w:r>
+      <w:r>
+        <w:t xml:space="preserve"> </w:t>
+      </w:r>
+      <w:r>
+        <w:t xml:space="preserve">associée à une expression</w:t>
+      </w:r>
+      <w:r>
+        <w:t xml:space="preserve"> </w:t>
       </w:r>
       <w:r>
         <w:rPr>
           <w:rStyle w:val="VerbatimChar"/>
         </w:rPr>
-        <w:t xml:space="preserve">ValueError</w:t>
-      </w:r>
-      <w:r>
-        <w:t xml:space="preserve">), et affiche un message adapté.</w:t>
+        <w:t xml:space="preserve">lambda</w:t>
+      </w:r>
+      <w:r>
+        <w:t xml:space="preserve"> </w:t>
+      </w:r>
+      <w:r>
+        <w:t xml:space="preserve">pour extraire uniquement les mots de longueur supérieure à 5 caractères d’une liste de chaînes.</w:t>
       </w:r>
     </w:p>
     <w:p>
@@ -1549,7 +1670,7 @@
         <w:t xml:space="preserve"> </w:t>
       </w:r>
       <w:r>
-        <w:t xml:space="preserve">Créez une fonction qui vérifie si un mot de passe possède au moins 8 caractères. Si ce n’est pas le cas, utilisez</w:t>
+        <w:t xml:space="preserve">Importez</w:t>
       </w:r>
       <w:r>
         <w:t xml:space="preserve"> </w:t>
@@ -1558,13 +1679,13 @@
         <w:rPr>
           <w:rStyle w:val="VerbatimChar"/>
         </w:rPr>
-        <w:t xml:space="preserve">raise</w:t>
-      </w:r>
-      <w:r>
-        <w:t xml:space="preserve"> </w:t>
-      </w:r>
-      <w:r>
-        <w:t xml:space="preserve">pour émettre une exception personnalisée de type</w:t>
+        <w:t xml:space="preserve">reduce</w:t>
+      </w:r>
+      <w:r>
+        <w:t xml:space="preserve"> </w:t>
+      </w:r>
+      <w:r>
+        <w:t xml:space="preserve">depuis</w:t>
       </w:r>
       <w:r>
         <w:t xml:space="preserve"> </w:t>
@@ -1573,14 +1694,17 @@
         <w:rPr>
           <w:rStyle w:val="VerbatimChar"/>
         </w:rPr>
-        <w:t xml:space="preserve">ValueError</w:t>
-      </w:r>
-      <w:r>
-        <w:t xml:space="preserve">.</w:t>
-      </w:r>
-    </w:p>
-    <w:bookmarkEnd w:id="24"/>
+        <w:t xml:space="preserve">functools</w:t>
+      </w:r>
+      <w:r>
+        <w:t xml:space="preserve"> </w:t>
+      </w:r>
+      <w:r>
+        <w:t xml:space="preserve">et écrivez un script qui calcule le produit de tous les éléments d’une liste d’entiers.</w:t>
+      </w:r>
+    </w:p>
     <w:bookmarkEnd w:id="25"/>
+    <w:bookmarkEnd w:id="26"/>
     <w:sectPr/>
   </w:body>
 </w:document>

</xml_diff>